<commit_message>
feat: add image in doc
</commit_message>
<xml_diff>
--- a/mysql/employees/O Banco de Dados e Suas Tabelas.docx
+++ b/mysql/employees/O Banco de Dados e Suas Tabelas.docx
@@ -27,15 +27,62 @@
     </w:p>
     <w:p>
       <w:r>
-        <w:t xml:space="preserve">O banco de dados </w:t>
-      </w:r>
-      <w:proofErr w:type="spellStart"/>
-      <w:r>
-        <w:t>employee</w:t>
-      </w:r>
-      <w:proofErr w:type="spellEnd"/>
-      <w:r>
-        <w:t xml:space="preserve"> é como se fosse um grande arquivo onde toda a informação da empresa está guardada. Dentro dele, a informação é organizada em tabelas, que são como planilhas com colunas (os campos) e linhas (os registros de dados).</w:t>
+        <w:t>O banco de dados employee é como se fosse um grande arquivo onde toda a informação da empresa está guardada. Dentro dele, a informação é organizada em tabelas, que são como planilhas com colunas (os campos) e linhas (os registros de dados).</w:t>
+      </w:r>
+    </w:p>
+    <w:p>
+      <w:r>
+        <w:rPr>
+          <w:noProof/>
+        </w:rPr>
+        <w:drawing>
+          <wp:inline distT="0" distB="0" distL="0" distR="0" wp14:anchorId="20D76EE4" wp14:editId="2525D187">
+            <wp:extent cx="5391150" cy="4419600"/>
+            <wp:effectExtent l="0" t="0" r="0" b="0"/>
+            <wp:docPr id="2003165087" name="Imagem 1"/>
+            <wp:cNvGraphicFramePr>
+              <a:graphicFrameLocks xmlns:a="http://schemas.openxmlformats.org/drawingml/2006/main" noChangeAspect="1"/>
+            </wp:cNvGraphicFramePr>
+            <a:graphic xmlns:a="http://schemas.openxmlformats.org/drawingml/2006/main">
+              <a:graphicData uri="http://schemas.openxmlformats.org/drawingml/2006/picture">
+                <pic:pic xmlns:pic="http://schemas.openxmlformats.org/drawingml/2006/picture">
+                  <pic:nvPicPr>
+                    <pic:cNvPr id="0" name="Picture 1"/>
+                    <pic:cNvPicPr>
+                      <a:picLocks noChangeAspect="1" noChangeArrowheads="1"/>
+                    </pic:cNvPicPr>
+                  </pic:nvPicPr>
+                  <pic:blipFill>
+                    <a:blip r:embed="rId5">
+                      <a:extLst>
+                        <a:ext uri="{28A0092B-C50C-407E-A947-70E740481C1C}">
+                          <a14:useLocalDpi xmlns:a14="http://schemas.microsoft.com/office/drawing/2010/main" val="0"/>
+                        </a:ext>
+                      </a:extLst>
+                    </a:blip>
+                    <a:srcRect/>
+                    <a:stretch>
+                      <a:fillRect/>
+                    </a:stretch>
+                  </pic:blipFill>
+                  <pic:spPr bwMode="auto">
+                    <a:xfrm>
+                      <a:off x="0" y="0"/>
+                      <a:ext cx="5391150" cy="4419600"/>
+                    </a:xfrm>
+                    <a:prstGeom prst="rect">
+                      <a:avLst/>
+                    </a:prstGeom>
+                    <a:noFill/>
+                    <a:ln>
+                      <a:noFill/>
+                    </a:ln>
+                  </pic:spPr>
+                </pic:pic>
+              </a:graphicData>
+            </a:graphic>
+          </wp:inline>
+        </w:drawing>
       </w:r>
     </w:p>
     <w:p>
@@ -50,21 +97,12 @@
           <w:numId w:val="1"/>
         </w:numPr>
       </w:pPr>
-      <w:proofErr w:type="spellStart"/>
       <w:r>
         <w:rPr>
           <w:b/>
           <w:bCs/>
         </w:rPr>
-        <w:t>employee</w:t>
-      </w:r>
-      <w:proofErr w:type="spellEnd"/>
-      <w:r>
-        <w:rPr>
-          <w:b/>
-          <w:bCs/>
-        </w:rPr>
-        <w:t xml:space="preserve"> (funcionários)</w:t>
+        <w:t>employee (funcionários)</w:t>
       </w:r>
       <w:r>
         <w:t>: Essa é a tabela principal. Ela guarda informações básicas sobre cada funcionário, como:</w:t>
@@ -77,13 +115,8 @@
           <w:numId w:val="1"/>
         </w:numPr>
       </w:pPr>
-      <w:proofErr w:type="spellStart"/>
-      <w:r>
-        <w:t>emp_no</w:t>
-      </w:r>
-      <w:proofErr w:type="spellEnd"/>
-      <w:r>
-        <w:t xml:space="preserve"> (número do funcionário): É o </w:t>
+      <w:r>
+        <w:t xml:space="preserve">emp_no (número do funcionário): É o </w:t>
       </w:r>
       <w:r>
         <w:rPr>
@@ -113,13 +146,8 @@
           <w:numId w:val="1"/>
         </w:numPr>
       </w:pPr>
-      <w:proofErr w:type="spellStart"/>
-      <w:r>
-        <w:t>birth_date</w:t>
-      </w:r>
-      <w:proofErr w:type="spellEnd"/>
-      <w:r>
-        <w:t xml:space="preserve"> (data de nascimento)</w:t>
+      <w:r>
+        <w:t>birth_date (data de nascimento)</w:t>
       </w:r>
     </w:p>
     <w:p>
@@ -129,13 +157,8 @@
           <w:numId w:val="1"/>
         </w:numPr>
       </w:pPr>
-      <w:proofErr w:type="spellStart"/>
-      <w:r>
-        <w:t>first_name</w:t>
-      </w:r>
-      <w:proofErr w:type="spellEnd"/>
-      <w:r>
-        <w:t xml:space="preserve"> (primeiro nome)</w:t>
+      <w:r>
+        <w:t>first_name (primeiro nome)</w:t>
       </w:r>
     </w:p>
     <w:p>
@@ -145,13 +168,8 @@
           <w:numId w:val="1"/>
         </w:numPr>
       </w:pPr>
-      <w:proofErr w:type="spellStart"/>
-      <w:r>
-        <w:t>last_name</w:t>
-      </w:r>
-      <w:proofErr w:type="spellEnd"/>
-      <w:r>
-        <w:t xml:space="preserve"> (sobrenome)</w:t>
+      <w:r>
+        <w:t>last_name (sobrenome)</w:t>
       </w:r>
     </w:p>
     <w:p>
@@ -161,13 +179,8 @@
           <w:numId w:val="1"/>
         </w:numPr>
       </w:pPr>
-      <w:proofErr w:type="spellStart"/>
-      <w:r>
-        <w:t>gender</w:t>
-      </w:r>
-      <w:proofErr w:type="spellEnd"/>
-      <w:r>
-        <w:t xml:space="preserve"> (gênero): Pode ser 'M' (masculino) ou 'F' (feminino).</w:t>
+      <w:r>
+        <w:t>gender (gênero): Pode ser 'M' (masculino) ou 'F' (feminino).</w:t>
       </w:r>
     </w:p>
     <w:p>
@@ -177,13 +190,8 @@
           <w:numId w:val="1"/>
         </w:numPr>
       </w:pPr>
-      <w:proofErr w:type="spellStart"/>
-      <w:r>
-        <w:t>hire_date</w:t>
-      </w:r>
-      <w:proofErr w:type="spellEnd"/>
-      <w:r>
-        <w:t xml:space="preserve"> (data de contratação)</w:t>
+      <w:r>
+        <w:t>hire_date (data de contratação)</w:t>
       </w:r>
     </w:p>
     <w:p>
@@ -193,21 +201,13 @@
           <w:numId w:val="1"/>
         </w:numPr>
       </w:pPr>
-      <w:proofErr w:type="spellStart"/>
       <w:r>
         <w:rPr>
           <w:b/>
           <w:bCs/>
         </w:rPr>
-        <w:t>department</w:t>
-      </w:r>
-      <w:proofErr w:type="spellEnd"/>
-      <w:r>
-        <w:rPr>
-          <w:b/>
-          <w:bCs/>
-        </w:rPr>
-        <w:t xml:space="preserve"> (departamentos)</w:t>
+        <w:lastRenderedPageBreak/>
+        <w:t>department (departamentos)</w:t>
       </w:r>
       <w:r>
         <w:t>: Aqui estão as informações sobre os departamentos da empresa, como Vendas, Marketing, Engenharia, etc.</w:t>
@@ -220,13 +220,8 @@
           <w:numId w:val="1"/>
         </w:numPr>
       </w:pPr>
-      <w:proofErr w:type="spellStart"/>
-      <w:r>
-        <w:t>dept_no</w:t>
-      </w:r>
-      <w:proofErr w:type="spellEnd"/>
-      <w:r>
-        <w:t xml:space="preserve"> (número do departamento): É o </w:t>
+      <w:r>
+        <w:t xml:space="preserve">dept_no (número do departamento): É o </w:t>
       </w:r>
       <w:r>
         <w:rPr>
@@ -256,13 +251,8 @@
           <w:numId w:val="1"/>
         </w:numPr>
       </w:pPr>
-      <w:proofErr w:type="spellStart"/>
-      <w:r>
-        <w:t>dept_name</w:t>
-      </w:r>
-      <w:proofErr w:type="spellEnd"/>
-      <w:r>
-        <w:t xml:space="preserve"> (nome do departamento): O nome completo do departamento, como 'Sales' ou 'Marketing'.</w:t>
+      <w:r>
+        <w:t>dept_name (nome do departamento): O nome completo do departamento, como 'Sales' ou 'Marketing'.</w:t>
       </w:r>
     </w:p>
     <w:p>
@@ -272,21 +262,12 @@
           <w:numId w:val="1"/>
         </w:numPr>
       </w:pPr>
-      <w:proofErr w:type="spellStart"/>
       <w:r>
         <w:rPr>
           <w:b/>
           <w:bCs/>
         </w:rPr>
-        <w:t>dept_emp</w:t>
-      </w:r>
-      <w:proofErr w:type="spellEnd"/>
-      <w:r>
-        <w:rPr>
-          <w:b/>
-          <w:bCs/>
-        </w:rPr>
-        <w:t xml:space="preserve"> (departamentos de funcionários)</w:t>
+        <w:t>dept_emp (departamentos de funcionários)</w:t>
       </w:r>
       <w:r>
         <w:t xml:space="preserve">: Esta tabela é crucial! Ela mostra </w:t>
@@ -309,21 +290,8 @@
           <w:numId w:val="1"/>
         </w:numPr>
       </w:pPr>
-      <w:proofErr w:type="spellStart"/>
-      <w:r>
-        <w:t>emp_no</w:t>
-      </w:r>
-      <w:proofErr w:type="spellEnd"/>
-      <w:r>
-        <w:t xml:space="preserve"> e </w:t>
-      </w:r>
-      <w:proofErr w:type="spellStart"/>
-      <w:r>
-        <w:t>dept_no</w:t>
-      </w:r>
-      <w:proofErr w:type="spellEnd"/>
-      <w:r>
-        <w:t xml:space="preserve">: Juntas, essas chaves formam a </w:t>
+      <w:r>
+        <w:t xml:space="preserve">emp_no e dept_no: Juntas, essas chaves formam a </w:t>
       </w:r>
       <w:r>
         <w:rPr>
@@ -343,21 +311,8 @@
           <w:numId w:val="1"/>
         </w:numPr>
       </w:pPr>
-      <w:proofErr w:type="spellStart"/>
-      <w:r>
-        <w:t>from_date</w:t>
-      </w:r>
-      <w:proofErr w:type="spellEnd"/>
-      <w:r>
-        <w:t xml:space="preserve"> e </w:t>
-      </w:r>
-      <w:proofErr w:type="spellStart"/>
-      <w:r>
-        <w:t>to_date</w:t>
-      </w:r>
-      <w:proofErr w:type="spellEnd"/>
-      <w:r>
-        <w:t xml:space="preserve"> (data de início e de fim): Permite ver o histórico de departamentos de um funcionário. Por exemplo, se alguém mudou do departamento de Vendas para o de Marketing.</w:t>
+      <w:r>
+        <w:t>from_date e to_date (data de início e de fim): Permite ver o histórico de departamentos de um funcionário. Por exemplo, se alguém mudou do departamento de Vendas para o de Marketing.</w:t>
       </w:r>
     </w:p>
     <w:p>
@@ -367,22 +322,12 @@
           <w:numId w:val="1"/>
         </w:numPr>
       </w:pPr>
-      <w:proofErr w:type="spellStart"/>
       <w:r>
         <w:rPr>
           <w:b/>
           <w:bCs/>
         </w:rPr>
-        <w:lastRenderedPageBreak/>
-        <w:t>dept_manager</w:t>
-      </w:r>
-      <w:proofErr w:type="spellEnd"/>
-      <w:r>
-        <w:rPr>
-          <w:b/>
-          <w:bCs/>
-        </w:rPr>
-        <w:t xml:space="preserve"> (gerentes de departamento)</w:t>
+        <w:t>dept_manager (gerentes de departamento)</w:t>
       </w:r>
       <w:r>
         <w:t xml:space="preserve">: Similar à tabela anterior, mas foca nos gerentes. Ela registra </w:t>
@@ -405,24 +350,66 @@
           <w:numId w:val="1"/>
         </w:numPr>
       </w:pPr>
-      <w:proofErr w:type="spellStart"/>
       <w:r>
         <w:rPr>
           <w:b/>
           <w:bCs/>
         </w:rPr>
-        <w:t>title</w:t>
-      </w:r>
-      <w:proofErr w:type="spellEnd"/>
+        <w:t>title (cargos)</w:t>
+      </w:r>
+      <w:r>
+        <w:t>: Essa tabela guarda todos os cargos que um funcionário já teve na empresa.</w:t>
+      </w:r>
+    </w:p>
+    <w:p>
+      <w:pPr>
+        <w:numPr>
+          <w:ilvl w:val="1"/>
+          <w:numId w:val="1"/>
+        </w:numPr>
+      </w:pPr>
+      <w:r>
+        <w:t>emp_no (número do funcionário)</w:t>
+      </w:r>
+    </w:p>
+    <w:p>
+      <w:pPr>
+        <w:numPr>
+          <w:ilvl w:val="1"/>
+          <w:numId w:val="1"/>
+        </w:numPr>
+      </w:pPr>
+      <w:r>
+        <w:t>title (cargo): O nome do cargo, como 'Engenheiro Sênior' ou 'Analista de Dados'.</w:t>
+      </w:r>
+    </w:p>
+    <w:p>
+      <w:pPr>
+        <w:numPr>
+          <w:ilvl w:val="1"/>
+          <w:numId w:val="1"/>
+        </w:numPr>
+      </w:pPr>
+      <w:r>
+        <w:t>from_date e to_date: Registram quando o funcionário começou e terminou de ter esse cargo.</w:t>
+      </w:r>
+    </w:p>
+    <w:p>
+      <w:pPr>
+        <w:numPr>
+          <w:ilvl w:val="0"/>
+          <w:numId w:val="1"/>
+        </w:numPr>
+      </w:pPr>
       <w:r>
         <w:rPr>
           <w:b/>
           <w:bCs/>
         </w:rPr>
-        <w:t xml:space="preserve"> (cargos)</w:t>
-      </w:r>
-      <w:r>
-        <w:t>: Essa tabela guarda todos os cargos que um funcionário já teve na empresa.</w:t>
+        <w:t>salary (salários)</w:t>
+      </w:r>
+      <w:r>
+        <w:t>: Contém o histórico de salários de cada funcionário ao longo do tempo.</w:t>
       </w:r>
     </w:p>
     <w:p>
@@ -432,13 +419,8 @@
           <w:numId w:val="1"/>
         </w:numPr>
       </w:pPr>
-      <w:proofErr w:type="spellStart"/>
-      <w:r>
-        <w:t>emp_no</w:t>
-      </w:r>
-      <w:proofErr w:type="spellEnd"/>
-      <w:r>
-        <w:t xml:space="preserve"> (número do funcionário)</w:t>
+      <w:r>
+        <w:t>emp_no (número do funcionário)</w:t>
       </w:r>
     </w:p>
     <w:p>
@@ -448,13 +430,8 @@
           <w:numId w:val="1"/>
         </w:numPr>
       </w:pPr>
-      <w:proofErr w:type="spellStart"/>
-      <w:r>
-        <w:t>title</w:t>
-      </w:r>
-      <w:proofErr w:type="spellEnd"/>
-      <w:r>
-        <w:t xml:space="preserve"> (cargo): O nome do cargo, como 'Engenheiro Sênior' ou 'Analista de Dados'.</w:t>
+      <w:r>
+        <w:t>amount (valor): O valor do salário.</w:t>
       </w:r>
     </w:p>
     <w:p>
@@ -464,109 +441,13 @@
           <w:numId w:val="1"/>
         </w:numPr>
       </w:pPr>
-      <w:proofErr w:type="spellStart"/>
-      <w:r>
-        <w:t>from_date</w:t>
-      </w:r>
-      <w:proofErr w:type="spellEnd"/>
-      <w:r>
-        <w:t xml:space="preserve"> e </w:t>
-      </w:r>
-      <w:proofErr w:type="spellStart"/>
-      <w:r>
-        <w:t>to_date</w:t>
-      </w:r>
-      <w:proofErr w:type="spellEnd"/>
-      <w:r>
-        <w:t>: Registram quando o funcionário começou e terminou de ter esse cargo.</w:t>
-      </w:r>
-    </w:p>
-    <w:p>
-      <w:pPr>
-        <w:numPr>
-          <w:ilvl w:val="0"/>
-          <w:numId w:val="1"/>
-        </w:numPr>
-      </w:pPr>
-      <w:proofErr w:type="spellStart"/>
-      <w:r>
-        <w:rPr>
-          <w:b/>
-          <w:bCs/>
-        </w:rPr>
-        <w:t>salary</w:t>
-      </w:r>
-      <w:proofErr w:type="spellEnd"/>
-      <w:r>
-        <w:rPr>
-          <w:b/>
-          <w:bCs/>
-        </w:rPr>
-        <w:t xml:space="preserve"> (salários)</w:t>
-      </w:r>
-      <w:r>
-        <w:t>: Contém o histórico de salários de cada funcionário ao longo do tempo.</w:t>
-      </w:r>
-    </w:p>
-    <w:p>
-      <w:pPr>
-        <w:numPr>
-          <w:ilvl w:val="1"/>
-          <w:numId w:val="1"/>
-        </w:numPr>
-      </w:pPr>
-      <w:proofErr w:type="spellStart"/>
-      <w:r>
-        <w:t>emp_no</w:t>
-      </w:r>
-      <w:proofErr w:type="spellEnd"/>
-      <w:r>
-        <w:t xml:space="preserve"> (número do funcionário)</w:t>
-      </w:r>
-    </w:p>
-    <w:p>
-      <w:pPr>
-        <w:numPr>
-          <w:ilvl w:val="1"/>
-          <w:numId w:val="1"/>
-        </w:numPr>
-      </w:pPr>
-      <w:proofErr w:type="spellStart"/>
-      <w:r>
-        <w:t>amount</w:t>
-      </w:r>
-      <w:proofErr w:type="spellEnd"/>
-      <w:r>
-        <w:t xml:space="preserve"> (valor): O valor do salário.</w:t>
-      </w:r>
-    </w:p>
-    <w:p>
-      <w:pPr>
-        <w:numPr>
-          <w:ilvl w:val="1"/>
-          <w:numId w:val="1"/>
-        </w:numPr>
-      </w:pPr>
-      <w:proofErr w:type="spellStart"/>
-      <w:r>
-        <w:t>from_date</w:t>
-      </w:r>
-      <w:proofErr w:type="spellEnd"/>
-      <w:r>
-        <w:t xml:space="preserve"> e </w:t>
-      </w:r>
-      <w:proofErr w:type="spellStart"/>
-      <w:r>
-        <w:t>to_date</w:t>
-      </w:r>
-      <w:proofErr w:type="spellEnd"/>
-      <w:r>
-        <w:t>: Indicam o período em que o funcionário recebeu aquele salário.</w:t>
+      <w:r>
+        <w:t>from_date e to_date: Indicam o período em que o funcionário recebeu aquele salário.</w:t>
       </w:r>
     </w:p>
     <w:sectPr>
       <w:pgSz w:w="11906" w:h="16838"/>
-      <w:pgMar w:top="1417" w:right="1701" w:bottom="1417" w:left="1701" w:header="708" w:footer="708" w:gutter="0"/>
+      <w:pgMar w:top="1440" w:right="1080" w:bottom="1440" w:left="1080" w:header="708" w:footer="708" w:gutter="0"/>
       <w:cols w:space="708"/>
       <w:docGrid w:linePitch="360"/>
     </w:sectPr>
@@ -1638,6 +1519,7 @@
   <w:style w:type="character" w:default="1" w:styleId="Fontepargpadro">
     <w:name w:val="Default Paragraph Font"/>
     <w:uiPriority w:val="1"/>
+    <w:semiHidden/>
     <w:unhideWhenUsed/>
   </w:style>
   <w:style w:type="table" w:default="1" w:styleId="Tabelanormal">

</xml_diff>